<commit_message>
update title of class_def docs
</commit_message>
<xml_diff>
--- a/documents/TSBOW_Class_Definition.docx
+++ b/documents/TSBOW_Class_Definition.docx
@@ -17,8 +17,222 @@
           <w:rFonts w:ascii="Cambria" w:hAnsi="Cambria"/>
           <w:b/>
           <w:bCs/>
+          <w:color w:val="FFCC00"/>
         </w:rPr>
-        <w:t>TSBOW</w:t>
+        <w:t>T</w:t>
+      </w:r>
+      <w:r>
+        <w:rPr>
+          <w:rFonts w:ascii="Cambria" w:hAnsi="Cambria"/>
+          <w:b/>
+          <w:bCs/>
+          <w:color w:val="33CCCC"/>
+        </w:rPr>
+        <w:t>S</w:t>
+      </w:r>
+      <w:r>
+        <w:rPr>
+          <w:rFonts w:ascii="Cambria" w:hAnsi="Cambria"/>
+          <w:b/>
+          <w:bCs/>
+          <w:color w:val="FF6600"/>
+        </w:rPr>
+        <w:t>B</w:t>
+      </w:r>
+      <w:r>
+        <w:rPr>
+          <w:rFonts w:ascii="Cambria" w:hAnsi="Cambria"/>
+          <w:b/>
+          <w:bCs/>
+          <w:color w:val="6699FF"/>
+        </w:rPr>
+        <w:t>O</w:t>
+      </w:r>
+      <w:r>
+        <w:rPr>
+          <w:rFonts w:ascii="Cambria" w:hAnsi="Cambria"/>
+          <w:b/>
+          <w:bCs/>
+          <w:color w:val="FF0066"/>
+        </w:rPr>
+        <w:t>W</w:t>
+      </w:r>
+    </w:p>
+    <w:p>
+      <w:pPr>
+        <w:pStyle w:val="Tiu"/>
+        <w:jc w:val="center"/>
+        <w:rPr>
+          <w:rFonts w:ascii="Cambria" w:hAnsi="Cambria"/>
+          <w:b/>
+          <w:bCs/>
+          <w:sz w:val="40"/>
+          <w:szCs w:val="40"/>
+        </w:rPr>
+      </w:pPr>
+      <w:r>
+        <w:rPr>
+          <w:rFonts w:ascii="Cambria" w:hAnsi="Cambria"/>
+          <w:b/>
+          <w:bCs/>
+          <w:color w:val="FFCC00"/>
+          <w:sz w:val="40"/>
+          <w:szCs w:val="40"/>
+          <w14:shadow w14:blurRad="139700" w14:dist="0" w14:dir="0" w14:sx="102000" w14:sy="102000" w14:kx="0" w14:ky="0" w14:algn="ctr">
+            <w14:srgbClr w14:val="FFFF00">
+              <w14:alpha w14:val="40000"/>
+            </w14:srgbClr>
+          </w14:shadow>
+        </w:rPr>
+        <w:t>T</w:t>
+      </w:r>
+      <w:r>
+        <w:rPr>
+          <w:rFonts w:ascii="Cambria" w:hAnsi="Cambria"/>
+          <w:b/>
+          <w:bCs/>
+          <w:sz w:val="40"/>
+          <w:szCs w:val="40"/>
+          <w14:shadow w14:blurRad="139700" w14:dist="0" w14:dir="0" w14:sx="102000" w14:sy="102000" w14:kx="0" w14:ky="0" w14:algn="ctr">
+            <w14:srgbClr w14:val="FFFF00">
+              <w14:alpha w14:val="40000"/>
+            </w14:srgbClr>
+          </w14:shadow>
+        </w:rPr>
+        <w:t>raffic</w:t>
+      </w:r>
+      <w:r>
+        <w:rPr>
+          <w:rFonts w:ascii="Cambria" w:hAnsi="Cambria"/>
+          <w:b/>
+          <w:bCs/>
+          <w:sz w:val="40"/>
+          <w:szCs w:val="40"/>
+        </w:rPr>
+        <w:t xml:space="preserve"> </w:t>
+      </w:r>
+      <w:r>
+        <w:rPr>
+          <w:rFonts w:ascii="Cambria" w:hAnsi="Cambria"/>
+          <w:b/>
+          <w:bCs/>
+          <w:color w:val="33CCCC"/>
+          <w:sz w:val="40"/>
+          <w:szCs w:val="40"/>
+          <w14:shadow w14:blurRad="139700" w14:dist="0" w14:dir="0" w14:sx="102000" w14:sy="102000" w14:kx="0" w14:ky="0" w14:algn="ctr">
+            <w14:srgbClr w14:val="33CCCC">
+              <w14:alpha w14:val="40000"/>
+            </w14:srgbClr>
+          </w14:shadow>
+        </w:rPr>
+        <w:t>S</w:t>
+      </w:r>
+      <w:r>
+        <w:rPr>
+          <w:rFonts w:ascii="Cambria" w:hAnsi="Cambria"/>
+          <w:b/>
+          <w:bCs/>
+          <w:sz w:val="40"/>
+          <w:szCs w:val="40"/>
+          <w14:shadow w14:blurRad="139700" w14:dist="0" w14:dir="0" w14:sx="102000" w14:sy="102000" w14:kx="0" w14:ky="0" w14:algn="ctr">
+            <w14:srgbClr w14:val="33CCCC">
+              <w14:alpha w14:val="40000"/>
+            </w14:srgbClr>
+          </w14:shadow>
+        </w:rPr>
+        <w:t>urveillance</w:t>
+      </w:r>
+      <w:r>
+        <w:rPr>
+          <w:rFonts w:ascii="Cambria" w:hAnsi="Cambria"/>
+          <w:b/>
+          <w:bCs/>
+          <w:sz w:val="40"/>
+          <w:szCs w:val="40"/>
+        </w:rPr>
+        <w:t xml:space="preserve"> </w:t>
+      </w:r>
+      <w:r>
+        <w:rPr>
+          <w:rFonts w:ascii="Cambria" w:hAnsi="Cambria"/>
+          <w:b/>
+          <w:bCs/>
+          <w:color w:val="FF6600"/>
+          <w:sz w:val="40"/>
+          <w:szCs w:val="40"/>
+          <w14:shadow w14:blurRad="139700" w14:dist="0" w14:dir="0" w14:sx="102000" w14:sy="102000" w14:kx="0" w14:ky="0" w14:algn="ctr">
+            <w14:srgbClr w14:val="FF6600">
+              <w14:alpha w14:val="40000"/>
+            </w14:srgbClr>
+          </w14:shadow>
+        </w:rPr>
+        <w:t>B</w:t>
+      </w:r>
+      <w:r>
+        <w:rPr>
+          <w:rFonts w:ascii="Cambria" w:hAnsi="Cambria"/>
+          <w:b/>
+          <w:bCs/>
+          <w:sz w:val="40"/>
+          <w:szCs w:val="40"/>
+          <w14:shadow w14:blurRad="139700" w14:dist="0" w14:dir="0" w14:sx="102000" w14:sy="102000" w14:kx="0" w14:ky="0" w14:algn="ctr">
+            <w14:srgbClr w14:val="FF6600">
+              <w14:alpha w14:val="40000"/>
+            </w14:srgbClr>
+          </w14:shadow>
+        </w:rPr>
+        <w:t>enchmark</w:t>
+      </w:r>
+      <w:r>
+        <w:rPr>
+          <w:rFonts w:ascii="Cambria" w:hAnsi="Cambria"/>
+          <w:b/>
+          <w:bCs/>
+          <w:sz w:val="40"/>
+          <w:szCs w:val="40"/>
+        </w:rPr>
+        <w:t xml:space="preserve"> for </w:t>
+      </w:r>
+      <w:r>
+        <w:rPr>
+          <w:rFonts w:ascii="Cambria" w:hAnsi="Cambria"/>
+          <w:b/>
+          <w:bCs/>
+          <w:color w:val="6699FF"/>
+          <w:sz w:val="40"/>
+          <w:szCs w:val="40"/>
+          <w14:shadow w14:blurRad="139700" w14:dist="0" w14:dir="0" w14:sx="102000" w14:sy="102000" w14:kx="0" w14:ky="0" w14:algn="ctr">
+            <w14:srgbClr w14:val="6699FF">
+              <w14:alpha w14:val="40000"/>
+            </w14:srgbClr>
+          </w14:shadow>
+        </w:rPr>
+        <w:t>O</w:t>
+      </w:r>
+      <w:r>
+        <w:rPr>
+          <w:rFonts w:ascii="Cambria" w:hAnsi="Cambria"/>
+          <w:b/>
+          <w:bCs/>
+          <w:sz w:val="40"/>
+          <w:szCs w:val="40"/>
+          <w14:shadow w14:blurRad="139700" w14:dist="0" w14:dir="0" w14:sx="102000" w14:sy="102000" w14:kx="0" w14:ky="0" w14:algn="ctr">
+            <w14:srgbClr w14:val="6699FF">
+              <w14:alpha w14:val="40000"/>
+            </w14:srgbClr>
+          </w14:shadow>
+        </w:rPr>
+        <w:t>ccluded vehicles</w:t>
+      </w:r>
+      <w:r>
+        <w:rPr>
+          <w:rFonts w:ascii="Cambria" w:hAnsi="Cambria"/>
+          <w:b/>
+          <w:bCs/>
+          <w:sz w:val="40"/>
+          <w:szCs w:val="40"/>
+        </w:rPr>
+        <w:t xml:space="preserve"> </w:t>
       </w:r>
     </w:p>
     <w:p>
@@ -41,21 +255,8 @@
           <w:sz w:val="40"/>
           <w:szCs w:val="40"/>
         </w:rPr>
-        <w:t xml:space="preserve">Traffic Surveillance Benchmark for Occluded vehicles </w:t>
+        <w:t xml:space="preserve">under </w:t>
       </w:r>
-    </w:p>
-    <w:p>
-      <w:pPr>
-        <w:pStyle w:val="Tiu"/>
-        <w:jc w:val="center"/>
-        <w:rPr>
-          <w:rFonts w:ascii="Cambria" w:hAnsi="Cambria"/>
-          <w:b/>
-          <w:bCs/>
-          <w:sz w:val="40"/>
-          <w:szCs w:val="40"/>
-        </w:rPr>
-      </w:pPr>
       <w:r>
         <w:rPr>
           <w:rFonts w:ascii="Cambria" w:hAnsi="Cambria"/>
@@ -63,8 +264,44 @@
           <w:bCs/>
           <w:sz w:val="40"/>
           <w:szCs w:val="40"/>
+          <w14:shadow w14:blurRad="139700" w14:dist="0" w14:dir="0" w14:sx="102000" w14:sy="102000" w14:kx="0" w14:ky="0" w14:algn="ctr">
+            <w14:srgbClr w14:val="FF0066">
+              <w14:alpha w14:val="40000"/>
+            </w14:srgbClr>
+          </w14:shadow>
         </w:rPr>
-        <w:t>under various Weather conditions</w:t>
+        <w:t xml:space="preserve">various </w:t>
+      </w:r>
+      <w:r>
+        <w:rPr>
+          <w:rFonts w:ascii="Cambria" w:hAnsi="Cambria"/>
+          <w:b/>
+          <w:bCs/>
+          <w:color w:val="FF0066"/>
+          <w:sz w:val="40"/>
+          <w:szCs w:val="40"/>
+          <w14:shadow w14:blurRad="139700" w14:dist="0" w14:dir="0" w14:sx="102000" w14:sy="102000" w14:kx="0" w14:ky="0" w14:algn="ctr">
+            <w14:srgbClr w14:val="FF0066">
+              <w14:alpha w14:val="40000"/>
+            </w14:srgbClr>
+          </w14:shadow>
+        </w:rPr>
+        <w:t>W</w:t>
+      </w:r>
+      <w:r>
+        <w:rPr>
+          <w:rFonts w:ascii="Cambria" w:hAnsi="Cambria"/>
+          <w:b/>
+          <w:bCs/>
+          <w:sz w:val="40"/>
+          <w:szCs w:val="40"/>
+          <w14:shadow w14:blurRad="139700" w14:dist="0" w14:dir="0" w14:sx="102000" w14:sy="102000" w14:kx="0" w14:ky="0" w14:algn="ctr">
+            <w14:srgbClr w14:val="FF0066">
+              <w14:alpha w14:val="40000"/>
+            </w14:srgbClr>
+          </w14:shadow>
+        </w:rPr>
+        <w:t>eather conditions</w:t>
       </w:r>
     </w:p>
     <w:p>
@@ -2648,7 +2885,6 @@
               <w:rPr>
                 <w:rFonts w:ascii="Cambria" w:hAnsi="Cambria"/>
               </w:rPr>
-              <w:lastRenderedPageBreak/>
               <w:t>3</w:t>
             </w:r>
           </w:p>
@@ -4652,7 +4888,7 @@
                 <w:noProof/>
               </w:rPr>
               <w:drawing>
-                <wp:inline distT="0" distB="0" distL="0" distR="0" wp14:anchorId="17ECE758" wp14:editId="07BF7E2F">
+                <wp:inline distT="0" distB="0" distL="0" distR="0" wp14:anchorId="17ECE758" wp14:editId="532AC9C6">
                   <wp:extent cx="679622" cy="604439"/>
                   <wp:effectExtent l="0" t="0" r="6350" b="5715"/>
                   <wp:docPr id="1233328762" name="Picture 2" descr="No description available."/>
@@ -7265,7 +7501,7 @@
           <w:noProof/>
         </w:rPr>
         <w:drawing>
-          <wp:inline distT="0" distB="0" distL="0" distR="0" wp14:anchorId="504721F2" wp14:editId="251DEAA5">
+          <wp:inline distT="0" distB="0" distL="0" distR="0" wp14:anchorId="504721F2" wp14:editId="240E499D">
             <wp:extent cx="5760000" cy="6135806"/>
             <wp:effectExtent l="0" t="0" r="6350" b="0"/>
             <wp:docPr id="335197624" name="Picture 1" descr="Detailed Icons of Truck of Different Types. Stock Vector - Illustration of  concrete, refrigerated: 254507031"/>

</xml_diff>

<commit_message>
update color palettes for documents
</commit_message>
<xml_diff>
--- a/documents/TSBOW_Class_Definition.docx
+++ b/documents/TSBOW_Class_Definition.docx
@@ -320,6 +320,7 @@
           <w:rFonts w:ascii="Cambria" w:hAnsi="Cambria"/>
           <w:b/>
           <w:bCs/>
+          <w:color w:val="001F3F"/>
           <w:sz w:val="40"/>
           <w:szCs w:val="40"/>
         </w:rPr>
@@ -329,6 +330,7 @@
           <w:rFonts w:ascii="Cambria" w:hAnsi="Cambria"/>
           <w:b/>
           <w:bCs/>
+          <w:color w:val="001F3F"/>
           <w:sz w:val="40"/>
           <w:szCs w:val="40"/>
         </w:rPr>
@@ -340,11 +342,13 @@
         <w:pStyle w:val="u1"/>
         <w:rPr>
           <w:rFonts w:ascii="Cambria" w:hAnsi="Cambria"/>
+          <w:color w:val="000080"/>
         </w:rPr>
       </w:pPr>
       <w:r>
         <w:rPr>
           <w:rFonts w:ascii="Cambria" w:hAnsi="Cambria"/>
+          <w:color w:val="000080"/>
         </w:rPr>
         <w:t>Class Definition</w:t>
       </w:r>
@@ -5807,11 +5811,13 @@
         <w:pStyle w:val="u1"/>
         <w:rPr>
           <w:rFonts w:ascii="Cambria" w:hAnsi="Cambria"/>
+          <w:color w:val="000080"/>
         </w:rPr>
       </w:pPr>
       <w:r>
         <w:rPr>
           <w:rFonts w:ascii="Cambria" w:hAnsi="Cambria"/>
+          <w:color w:val="000080"/>
         </w:rPr>
         <w:t>Labelling Policy</w:t>
       </w:r>
@@ -7150,11 +7156,13 @@
         <w:pStyle w:val="u1"/>
         <w:rPr>
           <w:rFonts w:ascii="Cambria" w:hAnsi="Cambria"/>
+          <w:color w:val="000080"/>
         </w:rPr>
       </w:pPr>
       <w:r>
         <w:rPr>
           <w:rFonts w:ascii="Cambria" w:hAnsi="Cambria"/>
+          <w:color w:val="000080"/>
         </w:rPr>
         <w:lastRenderedPageBreak/>
         <w:t>Questions</w:t>
@@ -7434,11 +7442,13 @@
         <w:pStyle w:val="u1"/>
         <w:rPr>
           <w:rFonts w:ascii="Cambria" w:hAnsi="Cambria"/>
+          <w:color w:val="000080"/>
         </w:rPr>
       </w:pPr>
       <w:r>
         <w:rPr>
           <w:rFonts w:ascii="Cambria" w:hAnsi="Cambria"/>
+          <w:color w:val="000080"/>
         </w:rPr>
         <w:lastRenderedPageBreak/>
         <w:t>References</w:t>

</xml_diff>